<commit_message>
refactor: pure cloud storage + update docs
</commit_message>
<xml_diff>
--- a/方案说明（终版）.docx
+++ b/方案说明（终版）.docx
@@ -251,8 +251,9 @@
       <w:r>
         <w:rPr>
           <w:rFonts w:ascii="Times New Roman" w:hAnsi="Times New Roman" w:eastAsia="楷体"/>
+          <w:color w:val="000000"/>
         </w:rPr>
-        <w:t>技术架构采用Vue 3 + Element Plus前端，Supabase云端数据库与localStorage双写策略，兼顾响应速度与数据持久化。部署于Vercel平台，</w:t>
+        <w:t>技术架构采用Vue 3 + Element Plus前端，Supabase云端数据库 + 内存缓存策略，兼顾响应速度与数据持久化。部署于Vercel平台，可能需要翻墙访问。</w:t>
       </w:r>
       <w:r>
         <w:rPr>
@@ -262,7 +263,6 @@
           <w:color w:val="FF0000"/>
           <w:lang w:val="en-US" w:eastAsia="zh-CN"/>
         </w:rPr>
-        <w:t>可能需要翻墙</w:t>
       </w:r>
       <w:r>
         <w:rPr>
@@ -271,13 +271,11 @@
           <w:bCs/>
           <w:color w:val="FF0000"/>
         </w:rPr>
-        <w:t>访问</w:t>
       </w:r>
       <w:r>
         <w:rPr>
           <w:rFonts w:ascii="Times New Roman" w:hAnsi="Times New Roman" w:eastAsia="楷体"/>
         </w:rPr>
-        <w:t>。</w:t>
       </w:r>
     </w:p>
     <w:p>
@@ -636,7 +634,7 @@
               <w:rPr>
                 <w:rFonts w:ascii="Times New Roman" w:hAnsi="Times New Roman" w:eastAsia="楷体"/>
               </w:rPr>
-              <w:t>localStorage（同步读写） + Supabase（异步云端持久化）</w:t>
+              <w:t>内存缓存（即时读写） + Supabase（异步云端持久化）</w:t>
             </w:r>
           </w:p>
         </w:tc>
@@ -1083,7 +1081,7 @@
               <w:rPr>
                 <w:rFonts w:ascii="Times New Roman" w:hAnsi="Times New Roman" w:eastAsia="楷体"/>
               </w:rPr>
-              <w:t>接入Supabase云端数据库，localStorage+Supabase双写策略，跨设备数据同步</w:t>
+              <w:t>内存缓存（即时读写） + Supabase（异步云端持久化）</w:t>
             </w:r>
           </w:p>
         </w:tc>

</xml_diff>

<commit_message>
fix: AI insight garbled text, resume check colors, community notes sync
</commit_message>
<xml_diff>
--- a/方案说明（终版）.docx
+++ b/方案说明（终版）.docx
@@ -60,7 +60,7 @@
         <w:rPr>
           <w:rFonts w:ascii="Times New Roman" w:hAnsi="Times New Roman" w:eastAsia="楷体"/>
         </w:rPr>
-        <w:t>当前高校毕业生求职面临三大核心痛点：</w:t>
+        <w:t>现在的年轻人求职，大多逃不过这三大坑：</w:t>
       </w:r>
     </w:p>
     <w:p>
@@ -119,7 +119,7 @@
         <w:rPr>
           <w:rFonts w:ascii="Times New Roman" w:hAnsi="Times New Roman" w:eastAsia="楷体"/>
         </w:rPr>
-        <w:t>传统求职平台仅提供信息聚合，缺乏AI驱动的个性化诊断与陪伴式引导。</w:t>
+        <w:t>传统平台只会甩岗位链接，缺乏真正懂你、帮你成长的AI伙伴。</w:t>
       </w:r>
     </w:p>
     <w:p>
@@ -148,7 +148,7 @@
         <w:rPr>
           <w:rFonts w:ascii="Times New Roman" w:hAnsi="Times New Roman" w:eastAsia="楷体"/>
         </w:rPr>
-        <w:t>本平台定位为"AI求职伴侣"，覆盖测→写→配→诊→沉淀全链路：</w:t>
+        <w:t>我们把求职拆成一条龙服务，测 写 配 诊 沉淀全搞定：</w:t>
       </w:r>
     </w:p>
     <w:p>
@@ -163,7 +163,7 @@
         <w:rPr>
           <w:rFonts w:ascii="Times New Roman" w:hAnsi="Times New Roman" w:eastAsia="楷体"/>
         </w:rPr>
-        <w:t>AI职业咨询：对话式引导梳理职业方向，配合MBTI/霍兰德测评辅助定位。</w:t>
+        <w:t>AI咨询：对话式梳理职业方向，配合MBTI/霍兰德测评辅助定位</w:t>
       </w:r>
     </w:p>
     <w:p>
@@ -178,7 +178,15 @@
         <w:rPr>
           <w:rFonts w:ascii="Times New Roman" w:hAnsi="Times New Roman" w:eastAsia="楷体"/>
         </w:rPr>
-        <w:t>简历全链路：上传AI解析、在线制作、多版本管理，按时间倒序排列。</w:t>
+        <w:t>简历全链路：上传AI解析、在线制作、多版本管理</w:t>
+      </w:r>
+      <w:bookmarkStart w:id="0" w:name="_GoBack"/>
+      <w:bookmarkEnd w:id="0"/>
+      <w:r>
+        <w:rPr>
+          <w:rFonts w:ascii="Times New Roman" w:hAnsi="Times New Roman" w:eastAsia="楷体"/>
+        </w:rPr>
+        <w:t>，最新版自动置顶</w:t>
       </w:r>
     </w:p>
     <w:p>
@@ -193,7 +201,7 @@
         <w:rPr>
           <w:rFonts w:ascii="Times New Roman" w:hAnsi="Times New Roman" w:eastAsia="楷体"/>
         </w:rPr>
-        <w:t>岗位智能匹配：30+模拟岗位，基于技能画像多维筛选，支持收藏。</w:t>
+        <w:t>岗位智能匹配：30+模拟岗位，基于技能画像筛选，支持收藏</w:t>
       </w:r>
     </w:p>
     <w:p>
@@ -223,7 +231,7 @@
         <w:rPr>
           <w:rFonts w:ascii="Times New Roman" w:hAnsi="Times New Roman" w:eastAsia="楷体"/>
         </w:rPr>
-        <w:t>心路日志：Flomo式私密记录，标签管理、日历看板、AI情绪趋势洞察。</w:t>
+        <w:t>心路日志：Flomo式轻量记录，标签管理、日历看板、AI情绪洞察</w:t>
       </w:r>
     </w:p>
     <w:p>
@@ -238,14 +246,15 @@
         <w:rPr>
           <w:rFonts w:ascii="Times New Roman" w:hAnsi="Times New Roman" w:eastAsia="楷体"/>
         </w:rPr>
-        <w:t>社区笔记：面经分享、点赞评论互动，分类检索，个人/公共双模式查看。</w:t>
+        <w:t>社区笔记：面经分享、点赞互动、分类检索，个人/公共双模式</w:t>
       </w:r>
     </w:p>
     <w:p>
       <w:pPr>
         <w:spacing w:after="120"/>
         <w:rPr>
-          <w:rFonts w:ascii="Times New Roman" w:hAnsi="Times New Roman" w:eastAsia="楷体"/>
+          <w:rFonts w:hint="eastAsia" w:ascii="Times New Roman" w:hAnsi="Times New Roman" w:eastAsia="楷体"/>
+          <w:lang w:eastAsia="zh-CN"/>
         </w:rPr>
       </w:pPr>
       <w:r>
@@ -253,7 +262,17 @@
           <w:rFonts w:ascii="Times New Roman" w:hAnsi="Times New Roman" w:eastAsia="楷体"/>
           <w:color w:val="000000"/>
         </w:rPr>
-        <w:t>技术架构采用Vue 3 + Element Plus前端，Supabase云端数据库 + 内存缓存策略，兼顾响应速度与数据持久化。部署于Vercel平台，可能需要翻墙访问。</w:t>
+        <w:t>技术架构：Vue 3 + Element Plus + Supabase 云端数据库 + 内存缓存，响应快、跨设备同步。部署于 Vercel 全球 CDN，开箱即用。</w:t>
+      </w:r>
+      <w:r>
+        <w:rPr>
+          <w:rFonts w:hint="eastAsia" w:ascii="Times New Roman" w:hAnsi="Times New Roman" w:eastAsia="楷体"/>
+          <w:b/>
+          <w:bCs/>
+          <w:color w:val="FF0000"/>
+          <w:lang w:eastAsia="zh-CN"/>
+        </w:rPr>
+        <w:t>（</w:t>
       </w:r>
       <w:r>
         <w:rPr>
@@ -263,19 +282,17 @@
           <w:color w:val="FF0000"/>
           <w:lang w:val="en-US" w:eastAsia="zh-CN"/>
         </w:rPr>
+        <w:t>注意可能需要翻墙使用</w:t>
       </w:r>
       <w:r>
         <w:rPr>
-          <w:rFonts w:ascii="Times New Roman" w:hAnsi="Times New Roman" w:eastAsia="楷体"/>
+          <w:rFonts w:hint="eastAsia" w:ascii="Times New Roman" w:hAnsi="Times New Roman" w:eastAsia="楷体"/>
           <w:b/>
           <w:bCs/>
           <w:color w:val="FF0000"/>
+          <w:lang w:eastAsia="zh-CN"/>
         </w:rPr>
-      </w:r>
-      <w:r>
-        <w:rPr>
-          <w:rFonts w:ascii="Times New Roman" w:hAnsi="Times New Roman" w:eastAsia="楷体"/>
-        </w:rPr>
+        <w:t>）</w:t>
       </w:r>
     </w:p>
     <w:p>
@@ -306,8 +323,6 @@
         </w:rPr>
         <w:t>选用硅基流动（SiliconFlow）API + DeepSeek-V4-Flash大模型</w:t>
       </w:r>
-      <w:bookmarkStart w:id="0" w:name="_GoBack"/>
-      <w:bookmarkEnd w:id="0"/>
     </w:p>
     <w:p>
       <w:pPr>
@@ -419,6 +434,12 @@
             <w:insideH w:val="single" w:color="4F81BD" w:themeColor="accent1" w:sz="8" w:space="0"/>
             <w:insideV w:val="single" w:color="4F81BD" w:themeColor="accent1" w:sz="8" w:space="0"/>
           </w:tblBorders>
+          <w:tblCellMar>
+            <w:top w:w="0" w:type="dxa"/>
+            <w:left w:w="108" w:type="dxa"/>
+            <w:bottom w:w="0" w:type="dxa"/>
+            <w:right w:w="108" w:type="dxa"/>
+          </w:tblCellMar>
         </w:tblPrEx>
         <w:trPr>
           <w:jc w:val="center"/>
@@ -822,6 +843,12 @@
             <w:insideH w:val="single" w:color="4F81BD" w:themeColor="accent1" w:sz="8" w:space="0"/>
             <w:insideV w:val="single" w:color="4F81BD" w:themeColor="accent1" w:sz="8" w:space="0"/>
           </w:tblBorders>
+          <w:tblCellMar>
+            <w:top w:w="0" w:type="dxa"/>
+            <w:left w:w="108" w:type="dxa"/>
+            <w:bottom w:w="0" w:type="dxa"/>
+            <w:right w:w="108" w:type="dxa"/>
+          </w:tblCellMar>
         </w:tblPrEx>
         <w:tc>
           <w:tcPr>
@@ -1107,14 +1134,7 @@
         <w:rPr>
           <w:rFonts w:ascii="Times New Roman" w:hAnsi="Times New Roman" w:eastAsia="楷体"/>
         </w:rPr>
-        <w:t>效果评估：平台实现11个功能页面、12条路由，覆盖求职全链路场景。数据本地响应&lt;10ms，云端同步&lt;500ms。AI功能全部基于真实大模型API调用，非模拟数据。</w:t>
-      </w:r>
-      <w:r>
-        <w:rPr>
-          <w:rFonts w:hint="eastAsia" w:ascii="Times New Roman" w:hAnsi="Times New Roman" w:eastAsia="楷体"/>
-          <w:lang w:val="en-US" w:eastAsia="zh-CN"/>
-        </w:rPr>
-        <w:t>后期可基于本版本进一步接入真实招聘软件获得真实岗位数据源，从而实现岗位的真正匹配。</w:t>
+        <w:t>效果：11个功能页面、12条路由，覆盖求职全链路。内存响应&lt;1ms，云端同步&lt;500ms。AI全部真实大模型调用，零成本公网部署。后续可接入真实招聘数据源，实现真正的岗位匹配。</w:t>
       </w:r>
     </w:p>
     <w:sectPr>
@@ -1359,8 +1379,8 @@
     <w:lsdException w:uiPriority="99" w:name="Normal Indent"/>
     <w:lsdException w:uiPriority="99" w:name="footnote text"/>
     <w:lsdException w:uiPriority="99" w:name="annotation text"/>
-    <w:lsdException w:uiPriority="99" w:semiHidden="0" w:name="header"/>
-    <w:lsdException w:uiPriority="99" w:semiHidden="0" w:name="footer"/>
+    <w:lsdException w:qFormat="1" w:uiPriority="99" w:semiHidden="0" w:name="header"/>
+    <w:lsdException w:qFormat="1" w:uiPriority="99" w:semiHidden="0" w:name="footer"/>
     <w:lsdException w:uiPriority="99" w:name="index heading"/>
     <w:lsdException w:qFormat="1" w:uiPriority="35" w:name="caption"/>
     <w:lsdException w:uiPriority="99" w:name="table of figures"/>
@@ -1375,30 +1395,30 @@
     <w:lsdException w:uiPriority="99" w:name="table of authorities"/>
     <w:lsdException w:uiPriority="99" w:semiHidden="0" w:name="macro"/>
     <w:lsdException w:uiPriority="99" w:name="toa heading"/>
-    <w:lsdException w:uiPriority="99" w:semiHidden="0" w:name="List"/>
+    <w:lsdException w:qFormat="1" w:uiPriority="99" w:semiHidden="0" w:name="List"/>
     <w:lsdException w:uiPriority="99" w:semiHidden="0" w:name="List Bullet"/>
     <w:lsdException w:uiPriority="99" w:semiHidden="0" w:name="List Number"/>
     <w:lsdException w:uiPriority="99" w:semiHidden="0" w:name="List 2"/>
     <w:lsdException w:uiPriority="99" w:semiHidden="0" w:name="List 3"/>
     <w:lsdException w:uiPriority="99" w:name="List 4"/>
     <w:lsdException w:uiPriority="99" w:name="List 5"/>
-    <w:lsdException w:uiPriority="99" w:semiHidden="0" w:name="List Bullet 2"/>
-    <w:lsdException w:uiPriority="99" w:semiHidden="0" w:name="List Bullet 3"/>
+    <w:lsdException w:qFormat="1" w:uiPriority="99" w:semiHidden="0" w:name="List Bullet 2"/>
+    <w:lsdException w:qFormat="1" w:uiPriority="99" w:semiHidden="0" w:name="List Bullet 3"/>
     <w:lsdException w:uiPriority="99" w:name="List Bullet 4"/>
     <w:lsdException w:uiPriority="99" w:name="List Bullet 5"/>
-    <w:lsdException w:uiPriority="99" w:semiHidden="0" w:name="List Number 2"/>
-    <w:lsdException w:uiPriority="99" w:semiHidden="0" w:name="List Number 3"/>
+    <w:lsdException w:qFormat="1" w:uiPriority="99" w:semiHidden="0" w:name="List Number 2"/>
+    <w:lsdException w:qFormat="1" w:uiPriority="99" w:semiHidden="0" w:name="List Number 3"/>
     <w:lsdException w:uiPriority="99" w:name="List Number 4"/>
     <w:lsdException w:uiPriority="99" w:name="List Number 5"/>
     <w:lsdException w:qFormat="1" w:unhideWhenUsed="0" w:uiPriority="10" w:semiHidden="0" w:name="Title"/>
     <w:lsdException w:uiPriority="99" w:name="Closing"/>
     <w:lsdException w:uiPriority="99" w:name="Signature"/>
-    <w:lsdException w:uiPriority="1" w:name="Default Paragraph Font"/>
+    <w:lsdException w:qFormat="1" w:uiPriority="1" w:name="Default Paragraph Font"/>
     <w:lsdException w:uiPriority="99" w:semiHidden="0" w:name="Body Text"/>
     <w:lsdException w:uiPriority="99" w:name="Body Text Indent"/>
-    <w:lsdException w:uiPriority="99" w:semiHidden="0" w:name="List Continue"/>
-    <w:lsdException w:uiPriority="99" w:semiHidden="0" w:name="List Continue 2"/>
-    <w:lsdException w:uiPriority="99" w:semiHidden="0" w:name="List Continue 3"/>
+    <w:lsdException w:qFormat="1" w:uiPriority="99" w:semiHidden="0" w:name="List Continue"/>
+    <w:lsdException w:qFormat="1" w:uiPriority="99" w:semiHidden="0" w:name="List Continue 2"/>
+    <w:lsdException w:qFormat="1" w:uiPriority="99" w:semiHidden="0" w:name="List Continue 3"/>
     <w:lsdException w:uiPriority="99" w:name="List Continue 4"/>
     <w:lsdException w:uiPriority="99" w:name="List Continue 5"/>
     <w:lsdException w:uiPriority="99" w:name="Message Header"/>
@@ -1408,8 +1428,8 @@
     <w:lsdException w:uiPriority="99" w:name="Body Text First Indent"/>
     <w:lsdException w:uiPriority="99" w:name="Body Text First Indent 2"/>
     <w:lsdException w:uiPriority="99" w:name="Note Heading"/>
-    <w:lsdException w:uiPriority="99" w:semiHidden="0" w:name="Body Text 2"/>
-    <w:lsdException w:uiPriority="99" w:semiHidden="0" w:name="Body Text 3"/>
+    <w:lsdException w:qFormat="1" w:uiPriority="99" w:semiHidden="0" w:name="Body Text 2"/>
+    <w:lsdException w:qFormat="1" w:uiPriority="99" w:semiHidden="0" w:name="Body Text 3"/>
     <w:lsdException w:uiPriority="99" w:name="Body Text Indent 2"/>
     <w:lsdException w:uiPriority="99" w:name="Body Text Indent 3"/>
     <w:lsdException w:uiPriority="99" w:name="Block Text"/>
@@ -1431,7 +1451,7 @@
     <w:lsdException w:uiPriority="99" w:name="HTML Sample"/>
     <w:lsdException w:uiPriority="99" w:name="HTML Typewriter"/>
     <w:lsdException w:uiPriority="99" w:name="HTML Variable"/>
-    <w:lsdException w:uiPriority="99" w:name="Normal Table"/>
+    <w:lsdException w:qFormat="1" w:uiPriority="99" w:name="Normal Table"/>
     <w:lsdException w:uiPriority="99" w:name="annotation subject"/>
     <w:lsdException w:uiPriority="99" w:name="Table Simple 1"/>
     <w:lsdException w:uiPriority="99" w:name="Table Simple 2"/>
@@ -1476,17 +1496,17 @@
     <w:lsdException w:uiPriority="99" w:name="Table Web 2"/>
     <w:lsdException w:uiPriority="99" w:name="Table Web 3"/>
     <w:lsdException w:uiPriority="99" w:name="Balloon Text"/>
-    <w:lsdException w:unhideWhenUsed="0" w:uiPriority="59" w:semiHidden="0" w:name="Table Grid"/>
+    <w:lsdException w:qFormat="1" w:unhideWhenUsed="0" w:uiPriority="59" w:semiHidden="0" w:name="Table Grid"/>
     <w:lsdException w:uiPriority="99" w:name="Table Theme"/>
     <w:lsdException w:qFormat="1" w:unhideWhenUsed="0" w:uiPriority="1" w:semiHidden="0" w:name="No Spacing"/>
     <w:lsdException w:unhideWhenUsed="0" w:uiPriority="60" w:semiHidden="0" w:name="Light Shading"/>
-    <w:lsdException w:unhideWhenUsed="0" w:uiPriority="61" w:semiHidden="0" w:name="Light List"/>
-    <w:lsdException w:unhideWhenUsed="0" w:uiPriority="62" w:semiHidden="0" w:name="Light Grid"/>
-    <w:lsdException w:unhideWhenUsed="0" w:uiPriority="63" w:semiHidden="0" w:name="Medium Shading 1"/>
-    <w:lsdException w:unhideWhenUsed="0" w:uiPriority="64" w:semiHidden="0" w:name="Medium Shading 2"/>
-    <w:lsdException w:unhideWhenUsed="0" w:uiPriority="65" w:semiHidden="0" w:name="Medium List 1"/>
+    <w:lsdException w:qFormat="1" w:unhideWhenUsed="0" w:uiPriority="61" w:semiHidden="0" w:name="Light List"/>
+    <w:lsdException w:qFormat="1" w:unhideWhenUsed="0" w:uiPriority="62" w:semiHidden="0" w:name="Light Grid"/>
+    <w:lsdException w:qFormat="1" w:unhideWhenUsed="0" w:uiPriority="63" w:semiHidden="0" w:name="Medium Shading 1"/>
+    <w:lsdException w:qFormat="1" w:unhideWhenUsed="0" w:uiPriority="64" w:semiHidden="0" w:name="Medium Shading 2"/>
+    <w:lsdException w:qFormat="1" w:unhideWhenUsed="0" w:uiPriority="65" w:semiHidden="0" w:name="Medium List 1"/>
     <w:lsdException w:unhideWhenUsed="0" w:uiPriority="66" w:semiHidden="0" w:name="Medium List 2"/>
-    <w:lsdException w:unhideWhenUsed="0" w:uiPriority="67" w:semiHidden="0" w:name="Medium Grid 1"/>
+    <w:lsdException w:qFormat="1" w:unhideWhenUsed="0" w:uiPriority="67" w:semiHidden="0" w:name="Medium Grid 1"/>
     <w:lsdException w:unhideWhenUsed="0" w:uiPriority="68" w:semiHidden="0" w:name="Medium Grid 2"/>
     <w:lsdException w:unhideWhenUsed="0" w:uiPriority="69" w:semiHidden="0" w:name="Medium Grid 3"/>
     <w:lsdException w:unhideWhenUsed="0" w:uiPriority="70" w:semiHidden="0" w:name="Dark List"/>
@@ -1494,16 +1514,16 @@
     <w:lsdException w:unhideWhenUsed="0" w:uiPriority="72" w:semiHidden="0" w:name="Colorful List"/>
     <w:lsdException w:unhideWhenUsed="0" w:uiPriority="73" w:semiHidden="0" w:name="Colorful Grid"/>
     <w:lsdException w:unhideWhenUsed="0" w:uiPriority="60" w:semiHidden="0" w:name="Light Shading Accent 1"/>
-    <w:lsdException w:unhideWhenUsed="0" w:uiPriority="61" w:semiHidden="0" w:name="Light List Accent 1"/>
-    <w:lsdException w:unhideWhenUsed="0" w:uiPriority="62" w:semiHidden="0" w:name="Light Grid Accent 1"/>
-    <w:lsdException w:unhideWhenUsed="0" w:uiPriority="63" w:semiHidden="0" w:name="Medium Shading 1 Accent 1"/>
+    <w:lsdException w:qFormat="1" w:unhideWhenUsed="0" w:uiPriority="61" w:semiHidden="0" w:name="Light List Accent 1"/>
+    <w:lsdException w:qFormat="1" w:unhideWhenUsed="0" w:uiPriority="62" w:semiHidden="0" w:name="Light Grid Accent 1"/>
+    <w:lsdException w:qFormat="1" w:unhideWhenUsed="0" w:uiPriority="63" w:semiHidden="0" w:name="Medium Shading 1 Accent 1"/>
     <w:lsdException w:unhideWhenUsed="0" w:uiPriority="64" w:semiHidden="0" w:name="Medium Shading 2 Accent 1"/>
-    <w:lsdException w:unhideWhenUsed="0" w:uiPriority="65" w:semiHidden="0" w:name="Medium List 1 Accent 1"/>
+    <w:lsdException w:qFormat="1" w:unhideWhenUsed="0" w:uiPriority="65" w:semiHidden="0" w:name="Medium List 1 Accent 1"/>
     <w:lsdException w:qFormat="1" w:unhideWhenUsed="0" w:uiPriority="34" w:semiHidden="0" w:name="List Paragraph"/>
     <w:lsdException w:qFormat="1" w:unhideWhenUsed="0" w:uiPriority="29" w:semiHidden="0" w:name="Quote"/>
     <w:lsdException w:qFormat="1" w:unhideWhenUsed="0" w:uiPriority="30" w:semiHidden="0" w:name="Intense Quote"/>
     <w:lsdException w:unhideWhenUsed="0" w:uiPriority="66" w:semiHidden="0" w:name="Medium List 2 Accent 1"/>
-    <w:lsdException w:unhideWhenUsed="0" w:uiPriority="67" w:semiHidden="0" w:name="Medium Grid 1 Accent 1"/>
+    <w:lsdException w:qFormat="1" w:unhideWhenUsed="0" w:uiPriority="67" w:semiHidden="0" w:name="Medium Grid 1 Accent 1"/>
     <w:lsdException w:unhideWhenUsed="0" w:uiPriority="68" w:semiHidden="0" w:name="Medium Grid 2 Accent 1"/>
     <w:lsdException w:unhideWhenUsed="0" w:uiPriority="69" w:semiHidden="0" w:name="Medium Grid 3 Accent 1"/>
     <w:lsdException w:unhideWhenUsed="0" w:uiPriority="70" w:semiHidden="0" w:name="Dark List Accent 1"/>
@@ -1511,24 +1531,24 @@
     <w:lsdException w:unhideWhenUsed="0" w:uiPriority="72" w:semiHidden="0" w:name="Colorful List Accent 1"/>
     <w:lsdException w:unhideWhenUsed="0" w:uiPriority="73" w:semiHidden="0" w:name="Colorful Grid Accent 1"/>
     <w:lsdException w:unhideWhenUsed="0" w:uiPriority="60" w:semiHidden="0" w:name="Light Shading Accent 2"/>
-    <w:lsdException w:unhideWhenUsed="0" w:uiPriority="61" w:semiHidden="0" w:name="Light List Accent 2"/>
+    <w:lsdException w:qFormat="1" w:unhideWhenUsed="0" w:uiPriority="61" w:semiHidden="0" w:name="Light List Accent 2"/>
     <w:lsdException w:unhideWhenUsed="0" w:uiPriority="62" w:semiHidden="0" w:name="Light Grid Accent 2"/>
-    <w:lsdException w:unhideWhenUsed="0" w:uiPriority="63" w:semiHidden="0" w:name="Medium Shading 1 Accent 2"/>
-    <w:lsdException w:unhideWhenUsed="0" w:uiPriority="64" w:semiHidden="0" w:name="Medium Shading 2 Accent 2"/>
-    <w:lsdException w:unhideWhenUsed="0" w:uiPriority="65" w:semiHidden="0" w:name="Medium List 1 Accent 2"/>
-    <w:lsdException w:unhideWhenUsed="0" w:uiPriority="66" w:semiHidden="0" w:name="Medium List 2 Accent 2"/>
+    <w:lsdException w:qFormat="1" w:unhideWhenUsed="0" w:uiPriority="63" w:semiHidden="0" w:name="Medium Shading 1 Accent 2"/>
+    <w:lsdException w:qFormat="1" w:unhideWhenUsed="0" w:uiPriority="64" w:semiHidden="0" w:name="Medium Shading 2 Accent 2"/>
+    <w:lsdException w:qFormat="1" w:unhideWhenUsed="0" w:uiPriority="65" w:semiHidden="0" w:name="Medium List 1 Accent 2"/>
+    <w:lsdException w:qFormat="1" w:unhideWhenUsed="0" w:uiPriority="66" w:semiHidden="0" w:name="Medium List 2 Accent 2"/>
     <w:lsdException w:unhideWhenUsed="0" w:uiPriority="67" w:semiHidden="0" w:name="Medium Grid 1 Accent 2"/>
     <w:lsdException w:unhideWhenUsed="0" w:uiPriority="68" w:semiHidden="0" w:name="Medium Grid 2 Accent 2"/>
     <w:lsdException w:unhideWhenUsed="0" w:uiPriority="69" w:semiHidden="0" w:name="Medium Grid 3 Accent 2"/>
     <w:lsdException w:unhideWhenUsed="0" w:uiPriority="70" w:semiHidden="0" w:name="Dark List Accent 2"/>
     <w:lsdException w:unhideWhenUsed="0" w:uiPriority="71" w:semiHidden="0" w:name="Colorful Shading Accent 2"/>
     <w:lsdException w:unhideWhenUsed="0" w:uiPriority="72" w:semiHidden="0" w:name="Colorful List Accent 2"/>
-    <w:lsdException w:unhideWhenUsed="0" w:uiPriority="73" w:semiHidden="0" w:name="Colorful Grid Accent 2"/>
+    <w:lsdException w:qFormat="1" w:unhideWhenUsed="0" w:uiPriority="73" w:semiHidden="0" w:name="Colorful Grid Accent 2"/>
     <w:lsdException w:unhideWhenUsed="0" w:uiPriority="60" w:semiHidden="0" w:name="Light Shading Accent 3"/>
     <w:lsdException w:unhideWhenUsed="0" w:uiPriority="61" w:semiHidden="0" w:name="Light List Accent 3"/>
     <w:lsdException w:unhideWhenUsed="0" w:uiPriority="62" w:semiHidden="0" w:name="Light Grid Accent 3"/>
     <w:lsdException w:unhideWhenUsed="0" w:uiPriority="63" w:semiHidden="0" w:name="Medium Shading 1 Accent 3"/>
-    <w:lsdException w:unhideWhenUsed="0" w:uiPriority="64" w:semiHidden="0" w:name="Medium Shading 2 Accent 3"/>
+    <w:lsdException w:qFormat="1" w:unhideWhenUsed="0" w:uiPriority="64" w:semiHidden="0" w:name="Medium Shading 2 Accent 3"/>
     <w:lsdException w:unhideWhenUsed="0" w:uiPriority="65" w:semiHidden="0" w:name="Medium List 1 Accent 3"/>
     <w:lsdException w:unhideWhenUsed="0" w:uiPriority="66" w:semiHidden="0" w:name="Medium List 2 Accent 3"/>
     <w:lsdException w:unhideWhenUsed="0" w:uiPriority="67" w:semiHidden="0" w:name="Medium Grid 1 Accent 3"/>
@@ -1536,27 +1556,27 @@
     <w:lsdException w:unhideWhenUsed="0" w:uiPriority="69" w:semiHidden="0" w:name="Medium Grid 3 Accent 3"/>
     <w:lsdException w:unhideWhenUsed="0" w:uiPriority="70" w:semiHidden="0" w:name="Dark List Accent 3"/>
     <w:lsdException w:unhideWhenUsed="0" w:uiPriority="71" w:semiHidden="0" w:name="Colorful Shading Accent 3"/>
-    <w:lsdException w:unhideWhenUsed="0" w:uiPriority="72" w:semiHidden="0" w:name="Colorful List Accent 3"/>
+    <w:lsdException w:qFormat="1" w:unhideWhenUsed="0" w:uiPriority="72" w:semiHidden="0" w:name="Colorful List Accent 3"/>
     <w:lsdException w:unhideWhenUsed="0" w:uiPriority="73" w:semiHidden="0" w:name="Colorful Grid Accent 3"/>
     <w:lsdException w:unhideWhenUsed="0" w:uiPriority="60" w:semiHidden="0" w:name="Light Shading Accent 4"/>
-    <w:lsdException w:unhideWhenUsed="0" w:uiPriority="61" w:semiHidden="0" w:name="Light List Accent 4"/>
+    <w:lsdException w:qFormat="1" w:unhideWhenUsed="0" w:uiPriority="61" w:semiHidden="0" w:name="Light List Accent 4"/>
     <w:lsdException w:unhideWhenUsed="0" w:uiPriority="62" w:semiHidden="0" w:name="Light Grid Accent 4"/>
-    <w:lsdException w:unhideWhenUsed="0" w:uiPriority="63" w:semiHidden="0" w:name="Medium Shading 1 Accent 4"/>
-    <w:lsdException w:unhideWhenUsed="0" w:uiPriority="64" w:semiHidden="0" w:name="Medium Shading 2 Accent 4"/>
+    <w:lsdException w:qFormat="1" w:unhideWhenUsed="0" w:uiPriority="63" w:semiHidden="0" w:name="Medium Shading 1 Accent 4"/>
+    <w:lsdException w:qFormat="1" w:unhideWhenUsed="0" w:uiPriority="64" w:semiHidden="0" w:name="Medium Shading 2 Accent 4"/>
     <w:lsdException w:unhideWhenUsed="0" w:uiPriority="65" w:semiHidden="0" w:name="Medium List 1 Accent 4"/>
     <w:lsdException w:unhideWhenUsed="0" w:uiPriority="66" w:semiHidden="0" w:name="Medium List 2 Accent 4"/>
     <w:lsdException w:unhideWhenUsed="0" w:uiPriority="67" w:semiHidden="0" w:name="Medium Grid 1 Accent 4"/>
-    <w:lsdException w:unhideWhenUsed="0" w:uiPriority="68" w:semiHidden="0" w:name="Medium Grid 2 Accent 4"/>
+    <w:lsdException w:qFormat="1" w:unhideWhenUsed="0" w:uiPriority="68" w:semiHidden="0" w:name="Medium Grid 2 Accent 4"/>
     <w:lsdException w:unhideWhenUsed="0" w:uiPriority="69" w:semiHidden="0" w:name="Medium Grid 3 Accent 4"/>
     <w:lsdException w:unhideWhenUsed="0" w:uiPriority="70" w:semiHidden="0" w:name="Dark List Accent 4"/>
     <w:lsdException w:unhideWhenUsed="0" w:uiPriority="71" w:semiHidden="0" w:name="Colorful Shading Accent 4"/>
     <w:lsdException w:unhideWhenUsed="0" w:uiPriority="72" w:semiHidden="0" w:name="Colorful List Accent 4"/>
     <w:lsdException w:unhideWhenUsed="0" w:uiPriority="73" w:semiHidden="0" w:name="Colorful Grid Accent 4"/>
     <w:lsdException w:unhideWhenUsed="0" w:uiPriority="60" w:semiHidden="0" w:name="Light Shading Accent 5"/>
-    <w:lsdException w:unhideWhenUsed="0" w:uiPriority="61" w:semiHidden="0" w:name="Light List Accent 5"/>
+    <w:lsdException w:qFormat="1" w:unhideWhenUsed="0" w:uiPriority="61" w:semiHidden="0" w:name="Light List Accent 5"/>
     <w:lsdException w:unhideWhenUsed="0" w:uiPriority="62" w:semiHidden="0" w:name="Light Grid Accent 5"/>
-    <w:lsdException w:unhideWhenUsed="0" w:uiPriority="63" w:semiHidden="0" w:name="Medium Shading 1 Accent 5"/>
-    <w:lsdException w:unhideWhenUsed="0" w:uiPriority="64" w:semiHidden="0" w:name="Medium Shading 2 Accent 5"/>
+    <w:lsdException w:qFormat="1" w:unhideWhenUsed="0" w:uiPriority="63" w:semiHidden="0" w:name="Medium Shading 1 Accent 5"/>
+    <w:lsdException w:qFormat="1" w:unhideWhenUsed="0" w:uiPriority="64" w:semiHidden="0" w:name="Medium Shading 2 Accent 5"/>
     <w:lsdException w:unhideWhenUsed="0" w:uiPriority="65" w:semiHidden="0" w:name="Medium List 1 Accent 5"/>
     <w:lsdException w:unhideWhenUsed="0" w:uiPriority="66" w:semiHidden="0" w:name="Medium List 2 Accent 5"/>
     <w:lsdException w:unhideWhenUsed="0" w:uiPriority="67" w:semiHidden="0" w:name="Medium Grid 1 Accent 5"/>
@@ -1566,12 +1586,12 @@
     <w:lsdException w:unhideWhenUsed="0" w:uiPriority="71" w:semiHidden="0" w:name="Colorful Shading Accent 5"/>
     <w:lsdException w:unhideWhenUsed="0" w:uiPriority="72" w:semiHidden="0" w:name="Colorful List Accent 5"/>
     <w:lsdException w:unhideWhenUsed="0" w:uiPriority="73" w:semiHidden="0" w:name="Colorful Grid Accent 5"/>
-    <w:lsdException w:unhideWhenUsed="0" w:uiPriority="60" w:semiHidden="0" w:name="Light Shading Accent 6"/>
-    <w:lsdException w:unhideWhenUsed="0" w:uiPriority="61" w:semiHidden="0" w:name="Light List Accent 6"/>
+    <w:lsdException w:qFormat="1" w:unhideWhenUsed="0" w:uiPriority="60" w:semiHidden="0" w:name="Light Shading Accent 6"/>
+    <w:lsdException w:qFormat="1" w:unhideWhenUsed="0" w:uiPriority="61" w:semiHidden="0" w:name="Light List Accent 6"/>
     <w:lsdException w:unhideWhenUsed="0" w:uiPriority="62" w:semiHidden="0" w:name="Light Grid Accent 6"/>
-    <w:lsdException w:unhideWhenUsed="0" w:uiPriority="63" w:semiHidden="0" w:name="Medium Shading 1 Accent 6"/>
-    <w:lsdException w:unhideWhenUsed="0" w:uiPriority="64" w:semiHidden="0" w:name="Medium Shading 2 Accent 6"/>
-    <w:lsdException w:unhideWhenUsed="0" w:uiPriority="65" w:semiHidden="0" w:name="Medium List 1 Accent 6"/>
+    <w:lsdException w:qFormat="1" w:unhideWhenUsed="0" w:uiPriority="63" w:semiHidden="0" w:name="Medium Shading 1 Accent 6"/>
+    <w:lsdException w:qFormat="1" w:unhideWhenUsed="0" w:uiPriority="64" w:semiHidden="0" w:name="Medium Shading 2 Accent 6"/>
+    <w:lsdException w:qFormat="1" w:unhideWhenUsed="0" w:uiPriority="65" w:semiHidden="0" w:name="Medium List 1 Accent 6"/>
     <w:lsdException w:unhideWhenUsed="0" w:uiPriority="66" w:semiHidden="0" w:name="Medium List 2 Accent 6"/>
     <w:lsdException w:unhideWhenUsed="0" w:uiPriority="67" w:semiHidden="0" w:name="Medium Grid 1 Accent 6"/>
     <w:lsdException w:unhideWhenUsed="0" w:uiPriority="68" w:semiHidden="0" w:name="Medium Grid 2 Accent 6"/>
@@ -1835,12 +1855,14 @@
     <w:name w:val="Default Paragraph Font"/>
     <w:semiHidden/>
     <w:unhideWhenUsed/>
+    <w:qFormat/>
     <w:uiPriority w:val="1"/>
   </w:style>
   <w:style w:type="table" w:default="1" w:styleId="32">
     <w:name w:val="Normal Table"/>
     <w:semiHidden/>
     <w:unhideWhenUsed/>
+    <w:qFormat/>
     <w:uiPriority w:val="99"/>
     <w:tblPr>
       <w:tblCellMar>
@@ -1889,6 +1911,7 @@
     <w:name w:val="List Number 2"/>
     <w:basedOn w:val="1"/>
     <w:unhideWhenUsed/>
+    <w:qFormat/>
     <w:uiPriority w:val="99"/>
     <w:pPr>
       <w:numPr>
@@ -1953,6 +1976,7 @@
     <w:basedOn w:val="1"/>
     <w:link w:val="146"/>
     <w:unhideWhenUsed/>
+    <w:qFormat/>
     <w:uiPriority w:val="99"/>
     <w:pPr>
       <w:spacing w:after="120"/>
@@ -1966,6 +1990,7 @@
     <w:name w:val="List Bullet 3"/>
     <w:basedOn w:val="1"/>
     <w:unhideWhenUsed/>
+    <w:qFormat/>
     <w:uiPriority w:val="99"/>
     <w:pPr>
       <w:numPr>
@@ -1989,6 +2014,7 @@
     <w:name w:val="List Number 3"/>
     <w:basedOn w:val="1"/>
     <w:unhideWhenUsed/>
+    <w:qFormat/>
     <w:uiPriority w:val="99"/>
     <w:pPr>
       <w:numPr>
@@ -2012,6 +2038,7 @@
     <w:name w:val="List Continue"/>
     <w:basedOn w:val="1"/>
     <w:unhideWhenUsed/>
+    <w:qFormat/>
     <w:uiPriority w:val="99"/>
     <w:pPr>
       <w:spacing w:after="120"/>
@@ -2023,6 +2050,7 @@
     <w:name w:val="List Bullet 2"/>
     <w:basedOn w:val="1"/>
     <w:unhideWhenUsed/>
+    <w:qFormat/>
     <w:uiPriority w:val="99"/>
     <w:pPr>
       <w:numPr>
@@ -2037,6 +2065,7 @@
     <w:basedOn w:val="1"/>
     <w:link w:val="136"/>
     <w:unhideWhenUsed/>
+    <w:qFormat/>
     <w:uiPriority w:val="99"/>
     <w:pPr>
       <w:tabs>
@@ -2051,6 +2080,7 @@
     <w:basedOn w:val="1"/>
     <w:link w:val="135"/>
     <w:unhideWhenUsed/>
+    <w:qFormat/>
     <w:uiPriority w:val="99"/>
     <w:pPr>
       <w:tabs>
@@ -2086,6 +2116,7 @@
     <w:name w:val="List"/>
     <w:basedOn w:val="1"/>
     <w:unhideWhenUsed/>
+    <w:qFormat/>
     <w:uiPriority w:val="99"/>
     <w:pPr>
       <w:ind w:left="360" w:hanging="360"/>
@@ -2097,6 +2128,7 @@
     <w:basedOn w:val="1"/>
     <w:link w:val="145"/>
     <w:unhideWhenUsed/>
+    <w:qFormat/>
     <w:uiPriority w:val="99"/>
     <w:pPr>
       <w:spacing w:after="120" w:line="480" w:lineRule="auto"/>
@@ -2106,6 +2138,7 @@
     <w:name w:val="List Continue 2"/>
     <w:basedOn w:val="1"/>
     <w:unhideWhenUsed/>
+    <w:qFormat/>
     <w:uiPriority w:val="99"/>
     <w:pPr>
       <w:spacing w:after="120"/>
@@ -2117,6 +2150,7 @@
     <w:name w:val="List Continue 3"/>
     <w:basedOn w:val="1"/>
     <w:unhideWhenUsed/>
+    <w:qFormat/>
     <w:uiPriority w:val="99"/>
     <w:pPr>
       <w:spacing w:after="120"/>
@@ -2150,6 +2184,7 @@
   <w:style w:type="table" w:styleId="33">
     <w:name w:val="Table Grid"/>
     <w:basedOn w:val="32"/>
+    <w:qFormat/>
     <w:uiPriority w:val="59"/>
     <w:pPr>
       <w:spacing w:after="0" w:line="240" w:lineRule="auto"/>
@@ -2768,6 +2803,7 @@
   <w:style w:type="table" w:styleId="40">
     <w:name w:val="Light Shading Accent 6"/>
     <w:basedOn w:val="32"/>
+    <w:qFormat/>
     <w:uiPriority w:val="60"/>
     <w:pPr>
       <w:spacing w:after="0" w:line="240" w:lineRule="auto"/>
@@ -2867,6 +2903,7 @@
   <w:style w:type="table" w:styleId="41">
     <w:name w:val="Light List"/>
     <w:basedOn w:val="32"/>
+    <w:qFormat/>
     <w:uiPriority w:val="61"/>
     <w:pPr>
       <w:spacing w:after="0" w:line="240" w:lineRule="auto"/>
@@ -2960,6 +2997,7 @@
   <w:style w:type="table" w:styleId="42">
     <w:name w:val="Light List Accent 1"/>
     <w:basedOn w:val="32"/>
+    <w:qFormat/>
     <w:uiPriority w:val="61"/>
     <w:pPr>
       <w:spacing w:after="0" w:line="240" w:lineRule="auto"/>
@@ -3053,6 +3091,7 @@
   <w:style w:type="table" w:styleId="43">
     <w:name w:val="Light List Accent 2"/>
     <w:basedOn w:val="32"/>
+    <w:qFormat/>
     <w:uiPriority w:val="61"/>
     <w:pPr>
       <w:spacing w:after="0" w:line="240" w:lineRule="auto"/>
@@ -3239,6 +3278,7 @@
   <w:style w:type="table" w:styleId="45">
     <w:name w:val="Light List Accent 4"/>
     <w:basedOn w:val="32"/>
+    <w:qFormat/>
     <w:uiPriority w:val="61"/>
     <w:pPr>
       <w:spacing w:after="0" w:line="240" w:lineRule="auto"/>
@@ -3332,6 +3372,7 @@
   <w:style w:type="table" w:styleId="46">
     <w:name w:val="Light List Accent 5"/>
     <w:basedOn w:val="32"/>
+    <w:qFormat/>
     <w:uiPriority w:val="61"/>
     <w:pPr>
       <w:spacing w:after="0" w:line="240" w:lineRule="auto"/>
@@ -3425,6 +3466,7 @@
   <w:style w:type="table" w:styleId="47">
     <w:name w:val="Light List Accent 6"/>
     <w:basedOn w:val="32"/>
+    <w:qFormat/>
     <w:uiPriority w:val="61"/>
     <w:pPr>
       <w:spacing w:after="0" w:line="240" w:lineRule="auto"/>
@@ -3518,6 +3560,7 @@
   <w:style w:type="table" w:styleId="48">
     <w:name w:val="Light Grid"/>
     <w:basedOn w:val="32"/>
+    <w:qFormat/>
     <w:uiPriority w:val="62"/>
     <w:pPr>
       <w:spacing w:after="0" w:line="240" w:lineRule="auto"/>
@@ -3644,6 +3687,7 @@
   <w:style w:type="table" w:styleId="49">
     <w:name w:val="Light Grid Accent 1"/>
     <w:basedOn w:val="32"/>
+    <w:qFormat/>
     <w:uiPriority w:val="62"/>
     <w:pPr>
       <w:spacing w:after="0" w:line="240" w:lineRule="auto"/>
@@ -4400,6 +4444,7 @@
   <w:style w:type="table" w:styleId="55">
     <w:name w:val="Medium Shading 1"/>
     <w:basedOn w:val="32"/>
+    <w:qFormat/>
     <w:uiPriority w:val="63"/>
     <w:pPr>
       <w:spacing w:after="0" w:line="240" w:lineRule="auto"/>
@@ -4507,6 +4552,7 @@
   <w:style w:type="table" w:styleId="56">
     <w:name w:val="Medium Shading 1 Accent 1"/>
     <w:basedOn w:val="32"/>
+    <w:qFormat/>
     <w:uiPriority w:val="63"/>
     <w:pPr>
       <w:spacing w:after="0" w:line="240" w:lineRule="auto"/>
@@ -4614,6 +4660,7 @@
   <w:style w:type="table" w:styleId="57">
     <w:name w:val="Medium Shading 1 Accent 2"/>
     <w:basedOn w:val="32"/>
+    <w:qFormat/>
     <w:uiPriority w:val="63"/>
     <w:pPr>
       <w:spacing w:after="0" w:line="240" w:lineRule="auto"/>
@@ -4828,6 +4875,7 @@
   <w:style w:type="table" w:styleId="59">
     <w:name w:val="Medium Shading 1 Accent 4"/>
     <w:basedOn w:val="32"/>
+    <w:qFormat/>
     <w:uiPriority w:val="63"/>
     <w:pPr>
       <w:spacing w:after="0" w:line="240" w:lineRule="auto"/>
@@ -4935,6 +4983,7 @@
   <w:style w:type="table" w:styleId="60">
     <w:name w:val="Medium Shading 1 Accent 5"/>
     <w:basedOn w:val="32"/>
+    <w:qFormat/>
     <w:uiPriority w:val="63"/>
     <w:pPr>
       <w:spacing w:after="0" w:line="240" w:lineRule="auto"/>
@@ -5042,6 +5091,7 @@
   <w:style w:type="table" w:styleId="61">
     <w:name w:val="Medium Shading 1 Accent 6"/>
     <w:basedOn w:val="32"/>
+    <w:qFormat/>
     <w:uiPriority w:val="63"/>
     <w:pPr>
       <w:spacing w:after="0" w:line="240" w:lineRule="auto"/>
@@ -5149,6 +5199,7 @@
   <w:style w:type="table" w:styleId="62">
     <w:name w:val="Medium Shading 2"/>
     <w:basedOn w:val="32"/>
+    <w:qFormat/>
     <w:uiPriority w:val="64"/>
     <w:pPr>
       <w:spacing w:after="0" w:line="240" w:lineRule="auto"/>
@@ -5479,6 +5530,7 @@
   <w:style w:type="table" w:styleId="64">
     <w:name w:val="Medium Shading 2 Accent 2"/>
     <w:basedOn w:val="32"/>
+    <w:qFormat/>
     <w:uiPriority w:val="64"/>
     <w:pPr>
       <w:spacing w:after="0" w:line="240" w:lineRule="auto"/>
@@ -5644,6 +5696,7 @@
   <w:style w:type="table" w:styleId="65">
     <w:name w:val="Medium Shading 2 Accent 3"/>
     <w:basedOn w:val="32"/>
+    <w:qFormat/>
     <w:uiPriority w:val="64"/>
     <w:pPr>
       <w:spacing w:after="0" w:line="240" w:lineRule="auto"/>
@@ -5809,6 +5862,7 @@
   <w:style w:type="table" w:styleId="66">
     <w:name w:val="Medium Shading 2 Accent 4"/>
     <w:basedOn w:val="32"/>
+    <w:qFormat/>
     <w:uiPriority w:val="64"/>
     <w:pPr>
       <w:spacing w:after="0" w:line="240" w:lineRule="auto"/>
@@ -5974,6 +6028,7 @@
   <w:style w:type="table" w:styleId="67">
     <w:name w:val="Medium Shading 2 Accent 5"/>
     <w:basedOn w:val="32"/>
+    <w:qFormat/>
     <w:uiPriority w:val="64"/>
     <w:pPr>
       <w:spacing w:after="0" w:line="240" w:lineRule="auto"/>
@@ -6139,6 +6194,7 @@
   <w:style w:type="table" w:styleId="68">
     <w:name w:val="Medium Shading 2 Accent 6"/>
     <w:basedOn w:val="32"/>
+    <w:qFormat/>
     <w:uiPriority w:val="64"/>
     <w:pPr>
       <w:spacing w:after="0" w:line="240" w:lineRule="auto"/>
@@ -6304,6 +6360,7 @@
   <w:style w:type="table" w:styleId="69">
     <w:name w:val="Medium List 1"/>
     <w:basedOn w:val="32"/>
+    <w:qFormat/>
     <w:uiPriority w:val="65"/>
     <w:pPr>
       <w:spacing w:after="0" w:line="240" w:lineRule="auto"/>
@@ -6394,6 +6451,7 @@
   <w:style w:type="table" w:styleId="70">
     <w:name w:val="Medium List 1 Accent 1"/>
     <w:basedOn w:val="32"/>
+    <w:qFormat/>
     <w:uiPriority w:val="65"/>
     <w:pPr>
       <w:spacing w:after="0" w:line="240" w:lineRule="auto"/>
@@ -6484,6 +6542,7 @@
   <w:style w:type="table" w:styleId="71">
     <w:name w:val="Medium List 1 Accent 2"/>
     <w:basedOn w:val="32"/>
+    <w:qFormat/>
     <w:uiPriority w:val="65"/>
     <w:pPr>
       <w:spacing w:after="0" w:line="240" w:lineRule="auto"/>
@@ -6844,6 +6903,7 @@
   <w:style w:type="table" w:styleId="75">
     <w:name w:val="Medium List 1 Accent 6"/>
     <w:basedOn w:val="32"/>
+    <w:qFormat/>
     <w:uiPriority w:val="65"/>
     <w:pPr>
       <w:spacing w:after="0" w:line="240" w:lineRule="auto"/>
@@ -7192,6 +7252,7 @@
   <w:style w:type="table" w:styleId="78">
     <w:name w:val="Medium List 2 Accent 2"/>
     <w:basedOn w:val="32"/>
+    <w:qFormat/>
     <w:uiPriority w:val="66"/>
     <w:pPr>
       <w:spacing w:after="0" w:line="240" w:lineRule="auto"/>
@@ -7837,6 +7898,7 @@
   <w:style w:type="table" w:styleId="83">
     <w:name w:val="Medium Grid 1"/>
     <w:basedOn w:val="32"/>
+    <w:qFormat/>
     <w:uiPriority w:val="67"/>
     <w:pPr>
       <w:spacing w:after="0" w:line="240" w:lineRule="auto"/>
@@ -7906,6 +7968,7 @@
   <w:style w:type="table" w:styleId="84">
     <w:name w:val="Medium Grid 1 Accent 1"/>
     <w:basedOn w:val="32"/>
+    <w:qFormat/>
     <w:uiPriority w:val="67"/>
     <w:pPr>
       <w:spacing w:after="0" w:line="240" w:lineRule="auto"/>
@@ -8904,6 +8967,7 @@
   <w:style w:type="table" w:styleId="94">
     <w:name w:val="Medium Grid 2 Accent 4"/>
     <w:basedOn w:val="32"/>
+    <w:qFormat/>
     <w:uiPriority w:val="68"/>
     <w:pPr>
       <w:spacing w:after="0" w:line="240" w:lineRule="auto"/>
@@ -12538,6 +12602,7 @@
   <w:style w:type="table" w:styleId="121">
     <w:name w:val="Colorful List Accent 3"/>
     <w:basedOn w:val="32"/>
+    <w:qFormat/>
     <w:uiPriority w:val="72"/>
     <w:pPr>
       <w:spacing w:after="0" w:line="240" w:lineRule="auto"/>
@@ -13098,6 +13163,7 @@
   <w:style w:type="table" w:styleId="127">
     <w:name w:val="Colorful Grid Accent 2"/>
     <w:basedOn w:val="32"/>
+    <w:qFormat/>
     <w:uiPriority w:val="73"/>
     <w:pPr>
       <w:spacing w:after="0" w:line="240" w:lineRule="auto"/>
@@ -13818,6 +13884,7 @@
     <w:basedOn w:val="132"/>
     <w:link w:val="8"/>
     <w:semiHidden/>
+    <w:qFormat/>
     <w:uiPriority w:val="9"/>
     <w:rPr>
       <w:rFonts w:asciiTheme="majorHAnsi" w:hAnsiTheme="majorHAnsi" w:eastAsiaTheme="majorEastAsia" w:cstheme="majorBidi"/>

</xml_diff>